<commit_message>
Fill in student details and GitHub links in submission documents
- Name Parva Chhatrola, ID 24CS013, header CSE304: Full Stack Development 24CS013
- Repository links now point to github.com/Parva-28/AWDF-24CS013
- README badge and checklist updated

Co-Authored-By: Claude Opus 5.5 <noreply@anthropic.com>
</commit_message>
<xml_diff>
--- a/practical-1/Practical-1-Submission.docx
+++ b/practical-1/Practical-1-Submission.docx
@@ -122,7 +122,7 @@
                 <w:sz w:val="22"/>
                 <w:szCs w:val="22"/>
               </w:rPr>
-              <w:t xml:space="preserve"/>
+              <w:t xml:space="preserve">Parva Chhatrola</w:t>
             </w:r>
           </w:p>
         </w:tc>
@@ -168,7 +168,7 @@
                 <w:sz w:val="22"/>
                 <w:szCs w:val="22"/>
               </w:rPr>
-              <w:t xml:space="preserve">ITUE301 – Advanced Web Development Frameworks</w:t>
+              <w:t xml:space="preserve">CSE304 – Full Stack Development</w:t>
             </w:r>
           </w:p>
         </w:tc>
@@ -403,7 +403,7 @@
           <w:sz w:val="22"/>
           <w:szCs w:val="22"/>
         </w:rPr>
-        <w:t xml:space="preserve">https://github.com/&lt;your-username&gt;/AWDF-24CS013/tree/main/practical-1/app</w:t>
+        <w:t xml:space="preserve">https://github.com/Parva-28/AWDF-24CS013/tree/main/practical-1/app</w:t>
       </w:r>
     </w:p>
     <w:p>
@@ -745,7 +745,7 @@
         <w:sz w:val="18"/>
         <w:szCs w:val="18"/>
       </w:rPr>
-      <w:t xml:space="preserve">CSE304: Full Stack Development             24CSXXX</w:t>
+      <w:t xml:space="preserve">CSE304: Full Stack Development             24CS013</w:t>
     </w:r>
   </w:p>
 </w:hdr>

</xml_diff>